<commit_message>
docs: rewrite chapter 5, add chapter 6, revise chapter 2
</commit_message>
<xml_diff>
--- a/docs/thesis/2026-10-22-data-dictionary.docx
+++ b/docs/thesis/2026-10-22-data-dictionary.docx
@@ -296,7 +296,7 @@
                 <w:sz w:val="28"/>
                 <w:szCs w:val="28"/>
               </w:rPr>
-              <w:t xml:space="preserve">id</w:t>
+              <w:t xml:space="preserve">user_id</w:t>
             </w:r>
           </w:p>
         </w:tc>
@@ -398,7 +398,7 @@
                 <w:sz w:val="28"/>
                 <w:szCs w:val="28"/>
               </w:rPr>
-              <w:t xml:space="preserve">รหัสผู้ใช้ อ้างอิง auth.users(id) · ลบตามเมื่อแถวแม่ถูกลบ</w:t>
+              <w:t xml:space="preserve">รหัสผู้ใช้ อ้างอิง auth.users(auth_id) · ลบตามเมื่อแถวแม่ถูกลบ (ในฐานข้อมูลชื่อคอลัมน์ id)</w:t>
             </w:r>
           </w:p>
         </w:tc>
@@ -1748,7 +1748,7 @@
                 <w:sz w:val="28"/>
                 <w:szCs w:val="28"/>
               </w:rPr>
-              <w:t xml:space="preserve">id</w:t>
+              <w:t xml:space="preserve">can_id</w:t>
             </w:r>
           </w:p>
         </w:tc>
@@ -1850,7 +1850,7 @@
                 <w:sz w:val="28"/>
                 <w:szCs w:val="28"/>
               </w:rPr>
-              <w:t xml:space="preserve">รหัสอ้างอิงโปรไฟล์ภายในระบบ</w:t>
+              <w:t xml:space="preserve">รหัสอ้างอิงโปรไฟล์ภายในระบบ (ในฐานข้อมูลชื่อคอลัมน์ id)</w:t>
             </w:r>
           </w:p>
         </w:tc>
@@ -3425,7 +3425,7 @@
                 <w:sz w:val="28"/>
                 <w:szCs w:val="28"/>
               </w:rPr>
-              <w:t xml:space="preserve">ผู้ใช้ที่นำเข้าข้อมูล อ้างอิง profiles(id) · ห้ามลบแถวแม่ที่ยังถูกอ้างอิง</w:t>
+              <w:t xml:space="preserve">ผู้ใช้ที่นำเข้าข้อมูล อ้างอิง profiles(user_id) · ห้ามลบแถวแม่ที่ยังถูกอ้างอิง</w:t>
             </w:r>
           </w:p>
         </w:tc>
@@ -4548,7 +4548,7 @@
                 <w:sz w:val="28"/>
                 <w:szCs w:val="28"/>
               </w:rPr>
-              <w:t xml:space="preserve">ingest_run_id</w:t>
+              <w:t xml:space="preserve">run_id</w:t>
             </w:r>
           </w:p>
         </w:tc>
@@ -4650,7 +4650,7 @@
                 <w:sz w:val="28"/>
                 <w:szCs w:val="28"/>
               </w:rPr>
-              <w:t xml:space="preserve">รอบการนำเข้าที่นำแถวนี้เข้ามา อ้างอิง ingest_runs(id) · เป็นค่าว่างเมื่อแถวแม่ถูกลบ</w:t>
+              <w:t xml:space="preserve">รอบการนำเข้าที่นำแถวนี้เข้ามา อ้างอิง ingest_runs(run_id) · เป็นค่าว่างเมื่อแถวแม่ถูกลบ</w:t>
             </w:r>
           </w:p>
         </w:tc>
@@ -5300,7 +5300,7 @@
                 <w:sz w:val="28"/>
                 <w:szCs w:val="28"/>
               </w:rPr>
-              <w:t xml:space="preserve">id</w:t>
+              <w:t xml:space="preserve">edu_id</w:t>
             </w:r>
           </w:p>
         </w:tc>
@@ -5402,7 +5402,7 @@
                 <w:sz w:val="28"/>
                 <w:szCs w:val="28"/>
               </w:rPr>
-              <w:t xml:space="preserve">รหัสลำดับประวัติการศึกษา</w:t>
+              <w:t xml:space="preserve">รหัสลำดับประวัติการศึกษา (ในฐานข้อมูลชื่อคอลัมน์ id)</w:t>
             </w:r>
           </w:p>
         </w:tc>
@@ -5475,7 +5475,7 @@
                 <w:sz w:val="28"/>
                 <w:szCs w:val="28"/>
               </w:rPr>
-              <w:t xml:space="preserve">candidate_id</w:t>
+              <w:t xml:space="preserve">can_id</w:t>
             </w:r>
           </w:p>
         </w:tc>
@@ -5577,7 +5577,7 @@
                 <w:sz w:val="28"/>
                 <w:szCs w:val="28"/>
               </w:rPr>
-              <w:t xml:space="preserve">ผู้สมัครเจ้าของประวัติ อ้างอิง candidates(id) · ลบตามเมื่อแถวแม่ถูกลบ</w:t>
+              <w:t xml:space="preserve">ผู้สมัครเจ้าของประวัติ อ้างอิง candidates(can_id) · ลบตามเมื่อแถวแม่ถูกลบ</w:t>
             </w:r>
           </w:p>
         </w:tc>
@@ -6927,7 +6927,7 @@
                 <w:sz w:val="28"/>
                 <w:szCs w:val="28"/>
               </w:rPr>
-              <w:t xml:space="preserve">id</w:t>
+              <w:t xml:space="preserve">exp_id</w:t>
             </w:r>
           </w:p>
         </w:tc>
@@ -7029,7 +7029,7 @@
                 <w:sz w:val="28"/>
                 <w:szCs w:val="28"/>
               </w:rPr>
-              <w:t xml:space="preserve">รหัสลำดับประวัติการทำงาน</w:t>
+              <w:t xml:space="preserve">รหัสลำดับประวัติการทำงาน (ในฐานข้อมูลชื่อคอลัมน์ id)</w:t>
             </w:r>
           </w:p>
         </w:tc>
@@ -7102,7 +7102,7 @@
                 <w:sz w:val="28"/>
                 <w:szCs w:val="28"/>
               </w:rPr>
-              <w:t xml:space="preserve">candidate_id</w:t>
+              <w:t xml:space="preserve">can_id</w:t>
             </w:r>
           </w:p>
         </w:tc>
@@ -7204,7 +7204,7 @@
                 <w:sz w:val="28"/>
                 <w:szCs w:val="28"/>
               </w:rPr>
-              <w:t xml:space="preserve">ผู้สมัครเจ้าของประวัติ อ้างอิง candidates(id) · ลบตามเมื่อแถวแม่ถูกลบ</w:t>
+              <w:t xml:space="preserve">ผู้สมัครเจ้าของประวัติ อ้างอิง candidates(can_id) · ลบตามเมื่อแถวแม่ถูกลบ</w:t>
             </w:r>
           </w:p>
         </w:tc>
@@ -8379,7 +8379,7 @@
                 <w:sz w:val="28"/>
                 <w:szCs w:val="28"/>
               </w:rPr>
-              <w:t xml:space="preserve">id</w:t>
+              <w:t xml:space="preserve">skill_id</w:t>
             </w:r>
           </w:p>
         </w:tc>
@@ -8481,7 +8481,7 @@
                 <w:sz w:val="28"/>
                 <w:szCs w:val="28"/>
               </w:rPr>
-              <w:t xml:space="preserve">รหัสทักษะ</w:t>
+              <w:t xml:space="preserve">รหัสทักษะ (ในฐานข้อมูลชื่อคอลัมน์ id)</w:t>
             </w:r>
           </w:p>
         </w:tc>
@@ -8956,7 +8956,7 @@
                 <w:sz w:val="28"/>
                 <w:szCs w:val="28"/>
               </w:rPr>
-              <w:t xml:space="preserve">candidate_id</w:t>
+              <w:t xml:space="preserve">can_id</w:t>
             </w:r>
           </w:p>
         </w:tc>
@@ -9058,7 +9058,7 @@
                 <w:sz w:val="28"/>
                 <w:szCs w:val="28"/>
               </w:rPr>
-              <w:t xml:space="preserve">ผู้สมัคร อ้างอิง candidates(id) · ลบตามเมื่อแถวแม่ถูกลบ</w:t>
+              <w:t xml:space="preserve">ผู้สมัคร อ้างอิง candidates(can_id) · ลบตามเมื่อแถวแม่ถูกลบ</w:t>
             </w:r>
           </w:p>
         </w:tc>
@@ -9233,7 +9233,7 @@
                 <w:sz w:val="28"/>
                 <w:szCs w:val="28"/>
               </w:rPr>
-              <w:t xml:space="preserve">ทักษะ อ้างอิง skills(id) · ลบตามเมื่อแถวแม่ถูกลบ</w:t>
+              <w:t xml:space="preserve">ทักษะ อ้างอิง skills(skill_id) · ลบตามเมื่อแถวแม่ถูกลบ</w:t>
             </w:r>
           </w:p>
         </w:tc>
@@ -9533,7 +9533,7 @@
                 <w:sz w:val="28"/>
                 <w:szCs w:val="28"/>
               </w:rPr>
-              <w:t xml:space="preserve">id</w:t>
+              <w:t xml:space="preserve">job_id</w:t>
             </w:r>
           </w:p>
         </w:tc>
@@ -9635,7 +9635,7 @@
                 <w:sz w:val="28"/>
                 <w:szCs w:val="28"/>
               </w:rPr>
-              <w:t xml:space="preserve">รหัสประจำตำแหน่งงาน (ค่าตั้งต้น gen_random_uuid())</w:t>
+              <w:t xml:space="preserve">รหัสประจำตำแหน่งงาน (ค่าตั้งต้น gen_random_uuid()) (ในฐานข้อมูลชื่อคอลัมน์ id)</w:t>
             </w:r>
           </w:p>
         </w:tc>
@@ -12035,7 +12035,7 @@
                 <w:sz w:val="28"/>
                 <w:szCs w:val="28"/>
               </w:rPr>
-              <w:t xml:space="preserve">id</w:t>
+              <w:t xml:space="preserve">ana_id</w:t>
             </w:r>
           </w:p>
         </w:tc>
@@ -12137,7 +12137,7 @@
                 <w:sz w:val="28"/>
                 <w:szCs w:val="28"/>
               </w:rPr>
-              <w:t xml:space="preserve">รหัสผลการประเมิน</w:t>
+              <w:t xml:space="preserve">รหัสผลการประเมิน (ในฐานข้อมูลชื่อคอลัมน์ id)</w:t>
             </w:r>
           </w:p>
         </w:tc>
@@ -12210,7 +12210,7 @@
                 <w:sz w:val="28"/>
                 <w:szCs w:val="28"/>
               </w:rPr>
-              <w:t xml:space="preserve">candidate_id</w:t>
+              <w:t xml:space="preserve">can_id</w:t>
             </w:r>
           </w:p>
         </w:tc>
@@ -12312,7 +12312,7 @@
                 <w:sz w:val="28"/>
                 <w:szCs w:val="28"/>
               </w:rPr>
-              <w:t xml:space="preserve">ผู้สมัครที่ถูกประเมิน อ้างอิง candidates(id) · ลบตามเมื่อแถวแม่ถูกลบ</w:t>
+              <w:t xml:space="preserve">ผู้สมัครที่ถูกประเมิน อ้างอิง candidates(can_id) · ลบตามเมื่อแถวแม่ถูกลบ</w:t>
             </w:r>
           </w:p>
         </w:tc>
@@ -13362,7 +13362,7 @@
                 <w:sz w:val="28"/>
                 <w:szCs w:val="28"/>
               </w:rPr>
-              <w:t xml:space="preserve">ตำแหน่งงานที่ใช้ประเมิน (ค่าว่างได้) อ้างอิง jobs(id) · ลบตามเมื่อแถวแม่ถูกลบ</w:t>
+              <w:t xml:space="preserve">ตำแหน่งงานที่ใช้ประเมิน (ค่าว่างได้) อ้างอิง jobs(job_id) · ลบตามเมื่อแถวแม่ถูกลบ</w:t>
             </w:r>
           </w:p>
         </w:tc>
@@ -13662,7 +13662,7 @@
                 <w:sz w:val="28"/>
                 <w:szCs w:val="28"/>
               </w:rPr>
-              <w:t xml:space="preserve">id</w:t>
+              <w:t xml:space="preserve">sl_id</w:t>
             </w:r>
           </w:p>
         </w:tc>
@@ -13764,7 +13764,7 @@
                 <w:sz w:val="28"/>
                 <w:szCs w:val="28"/>
               </w:rPr>
-              <w:t xml:space="preserve">รหัสประจำรายการ</w:t>
+              <w:t xml:space="preserve">รหัสประจำรายการ (ในฐานข้อมูลชื่อคอลัมน์ id)</w:t>
             </w:r>
           </w:p>
         </w:tc>
@@ -14114,7 +14114,7 @@
                 <w:sz w:val="28"/>
                 <w:szCs w:val="28"/>
               </w:rPr>
-              <w:t xml:space="preserve">เจ้าของรายการ อ้างอิง profiles(id) · ลบตามเมื่อแถวแม่ถูกลบ</w:t>
+              <w:t xml:space="preserve">เจ้าของรายการ อ้างอิง profiles(user_id) · ลบตามเมื่อแถวแม่ถูกลบ</w:t>
             </w:r>
           </w:p>
         </w:tc>
@@ -14589,7 +14589,7 @@
                 <w:sz w:val="28"/>
                 <w:szCs w:val="28"/>
               </w:rPr>
-              <w:t xml:space="preserve">shortlist_id</w:t>
+              <w:t xml:space="preserve">sl_id</w:t>
             </w:r>
           </w:p>
         </w:tc>
@@ -14691,7 +14691,7 @@
                 <w:sz w:val="28"/>
                 <w:szCs w:val="28"/>
               </w:rPr>
-              <w:t xml:space="preserve">รายการ Shortlist อ้างอิง shortlists(id) · ลบตามเมื่อแถวแม่ถูกลบ</w:t>
+              <w:t xml:space="preserve">รายการ Shortlist อ้างอิง shortlists(sl_id) · ลบตามเมื่อแถวแม่ถูกลบ</w:t>
             </w:r>
           </w:p>
         </w:tc>
@@ -14764,7 +14764,7 @@
                 <w:sz w:val="28"/>
                 <w:szCs w:val="28"/>
               </w:rPr>
-              <w:t xml:space="preserve">candidate_id</w:t>
+              <w:t xml:space="preserve">can_id</w:t>
             </w:r>
           </w:p>
         </w:tc>
@@ -14866,7 +14866,7 @@
                 <w:sz w:val="28"/>
                 <w:szCs w:val="28"/>
               </w:rPr>
-              <w:t xml:space="preserve">ผู้สมัครในรายการ อ้างอิง candidates(id) · ลบตามเมื่อแถวแม่ถูกลบ</w:t>
+              <w:t xml:space="preserve">ผู้สมัครในรายการ อ้างอิง candidates(can_id) · ลบตามเมื่อแถวแม่ถูกลบ</w:t>
             </w:r>
           </w:p>
         </w:tc>
@@ -15166,7 +15166,7 @@
                 <w:sz w:val="28"/>
                 <w:szCs w:val="28"/>
               </w:rPr>
-              <w:t xml:space="preserve">id</w:t>
+              <w:t xml:space="preserve">sp_id</w:t>
             </w:r>
           </w:p>
         </w:tc>
@@ -15268,7 +15268,7 @@
                 <w:sz w:val="28"/>
                 <w:szCs w:val="28"/>
               </w:rPr>
-              <w:t xml:space="preserve">รหัสโปรไฟล์</w:t>
+              <w:t xml:space="preserve">รหัสโปรไฟล์ (ในฐานข้อมูลชื่อคอลัมน์ id)</w:t>
             </w:r>
           </w:p>
         </w:tc>
@@ -15443,7 +15443,7 @@
                 <w:sz w:val="28"/>
                 <w:szCs w:val="28"/>
               </w:rPr>
-              <w:t xml:space="preserve">เจ้าของโปรไฟล์ อ้างอิง profiles(id) · ลบตามเมื่อแถวแม่ถูกลบ</w:t>
+              <w:t xml:space="preserve">เจ้าของโปรไฟล์ อ้างอิง profiles(user_id) · ลบตามเมื่อแถวแม่ถูกลบ</w:t>
             </w:r>
           </w:p>
         </w:tc>
@@ -16968,7 +16968,7 @@
                 <w:sz w:val="28"/>
                 <w:szCs w:val="28"/>
               </w:rPr>
-              <w:t xml:space="preserve">id</w:t>
+              <w:t xml:space="preserve">ra_id</w:t>
             </w:r>
           </w:p>
         </w:tc>
@@ -17070,7 +17070,7 @@
                 <w:sz w:val="28"/>
                 <w:szCs w:val="28"/>
               </w:rPr>
-              <w:t xml:space="preserve">รหัสผลการประเมิน</w:t>
+              <w:t xml:space="preserve">รหัสผลการประเมิน (ในฐานข้อมูลชื่อคอลัมน์ id)</w:t>
             </w:r>
           </w:p>
         </w:tc>
@@ -17143,7 +17143,7 @@
                 <w:sz w:val="28"/>
                 <w:szCs w:val="28"/>
               </w:rPr>
-              <w:t xml:space="preserve">profile_id</w:t>
+              <w:t xml:space="preserve">sp_id</w:t>
             </w:r>
           </w:p>
         </w:tc>
@@ -17245,7 +17245,7 @@
                 <w:sz w:val="28"/>
                 <w:szCs w:val="28"/>
               </w:rPr>
-              <w:t xml:space="preserve">โปรไฟล์ที่ถูกประเมิน อ้างอิง self_profiles(id) · ลบตามเมื่อแถวแม่ถูกลบ</w:t>
+              <w:t xml:space="preserve">โปรไฟล์ที่ถูกประเมิน อ้างอิง self_profiles(sp_id) · ลบตามเมื่อแถวแม่ถูกลบ</w:t>
             </w:r>
           </w:p>
         </w:tc>
@@ -18420,7 +18420,7 @@
                 <w:sz w:val="28"/>
                 <w:szCs w:val="28"/>
               </w:rPr>
-              <w:t xml:space="preserve">id</w:t>
+              <w:t xml:space="preserve">run_id</w:t>
             </w:r>
           </w:p>
         </w:tc>
@@ -18522,7 +18522,7 @@
                 <w:sz w:val="28"/>
                 <w:szCs w:val="28"/>
               </w:rPr>
-              <w:t xml:space="preserve">รหัสรอบการนำเข้า</w:t>
+              <w:t xml:space="preserve">รหัสรอบการนำเข้า (ในฐานข้อมูลชื่อคอลัมน์ id)</w:t>
             </w:r>
           </w:p>
         </w:tc>
@@ -20922,7 +20922,7 @@
                 <w:sz w:val="28"/>
                 <w:szCs w:val="28"/>
               </w:rPr>
-              <w:t xml:space="preserve">id</w:t>
+              <w:t xml:space="preserve">pend_id</w:t>
             </w:r>
           </w:p>
         </w:tc>
@@ -21024,7 +21024,7 @@
                 <w:sz w:val="28"/>
                 <w:szCs w:val="28"/>
               </w:rPr>
-              <w:t xml:space="preserve">รหัสรายการในคิว</w:t>
+              <w:t xml:space="preserve">รหัสรายการในคิว (ในฐานข้อมูลชื่อคอลัมน์ id)</w:t>
             </w:r>
           </w:p>
         </w:tc>
@@ -21097,7 +21097,7 @@
                 <w:sz w:val="28"/>
                 <w:szCs w:val="28"/>
               </w:rPr>
-              <w:t xml:space="preserve">ingest_run_id</w:t>
+              <w:t xml:space="preserve">run_id</w:t>
             </w:r>
           </w:p>
         </w:tc>
@@ -21199,7 +21199,7 @@
                 <w:sz w:val="28"/>
                 <w:szCs w:val="28"/>
               </w:rPr>
-              <w:t xml:space="preserve">รอบการนำเข้าที่นำแถวนี้เข้ามา อ้างอิง ingest_runs(id) · เป็นค่าว่างเมื่อแถวแม่ถูกลบ</w:t>
+              <w:t xml:space="preserve">รอบการนำเข้าที่นำแถวนี้เข้ามา อ้างอิง ingest_runs(run_id) · เป็นค่าว่างเมื่อแถวแม่ถูกลบ</w:t>
             </w:r>
           </w:p>
         </w:tc>
@@ -22424,7 +22424,7 @@
                 <w:sz w:val="28"/>
                 <w:szCs w:val="28"/>
               </w:rPr>
-              <w:t xml:space="preserve">ผู้ตรวจรายการ อ้างอิง profiles(id) · เป็นค่าว่างเมื่อแถวแม่ถูกลบ</w:t>
+              <w:t xml:space="preserve">ผู้ตรวจรายการ อ้างอิง profiles(user_id) · เป็นค่าว่างเมื่อแถวแม่ถูกลบ</w:t>
             </w:r>
           </w:p>
         </w:tc>
@@ -23074,7 +23074,7 @@
                 <w:sz w:val="28"/>
                 <w:szCs w:val="28"/>
               </w:rPr>
-              <w:t xml:space="preserve">id</w:t>
+              <w:t xml:space="preserve">sup_id</w:t>
             </w:r>
           </w:p>
         </w:tc>
@@ -23176,7 +23176,7 @@
                 <w:sz w:val="28"/>
                 <w:szCs w:val="28"/>
               </w:rPr>
-              <w:t xml:space="preserve">รหัสรายการ</w:t>
+              <w:t xml:space="preserve">รหัสรายการ (ในฐานข้อมูลชื่อคอลัมน์ id)</w:t>
             </w:r>
           </w:p>
         </w:tc>
@@ -23876,7 +23876,7 @@
                 <w:sz w:val="28"/>
                 <w:szCs w:val="28"/>
               </w:rPr>
-              <w:t xml:space="preserve">ผู้บันทึกการระงับ อ้างอิง profiles(id) · เป็นค่าว่างเมื่อแถวแม่ถูกลบ</w:t>
+              <w:t xml:space="preserve">ผู้บันทึกการระงับ อ้างอิง profiles(user_id) · เป็นค่าว่างเมื่อแถวแม่ถูกลบ</w:t>
             </w:r>
           </w:p>
         </w:tc>
@@ -24351,7 +24351,7 @@
                 <w:sz w:val="28"/>
                 <w:szCs w:val="28"/>
               </w:rPr>
-              <w:t xml:space="preserve">id</w:t>
+              <w:t xml:space="preserve">log_id</w:t>
             </w:r>
           </w:p>
         </w:tc>
@@ -24453,7 +24453,7 @@
                 <w:sz w:val="28"/>
                 <w:szCs w:val="28"/>
               </w:rPr>
-              <w:t xml:space="preserve">รหัสบันทึก</w:t>
+              <w:t xml:space="preserve">รหัสบันทึก (ในฐานข้อมูลชื่อคอลัมน์ id)</w:t>
             </w:r>
           </w:p>
         </w:tc>
@@ -24628,7 +24628,7 @@
                 <w:sz w:val="28"/>
                 <w:szCs w:val="28"/>
               </w:rPr>
-              <w:t xml:space="preserve">ผู้กระทำ (ค่าว่าง = ระบบทำเอง) อ้างอิง profiles(id) · เป็นค่าว่างเมื่อแถวแม่ถูกลบ</w:t>
+              <w:t xml:space="preserve">ผู้กระทำ (ค่าว่าง = ระบบทำเอง) อ้างอิง profiles(user_id) · เป็นค่าว่างเมื่อแถวแม่ถูกลบ</w:t>
             </w:r>
           </w:p>
         </w:tc>
@@ -26153,7 +26153,7 @@
                 <w:sz w:val="28"/>
                 <w:szCs w:val="28"/>
               </w:rPr>
-              <w:t xml:space="preserve">id</w:t>
+              <w:t xml:space="preserve">auth_id</w:t>
             </w:r>
           </w:p>
         </w:tc>
@@ -26255,7 +26255,7 @@
                 <w:sz w:val="28"/>
                 <w:szCs w:val="28"/>
               </w:rPr>
-              <w:t xml:space="preserve">รหัสบัญชีผู้ใช้ ซึ่ง profiles.id อ้างอิงถึง</w:t>
+              <w:t xml:space="preserve">รหัสบัญชีผู้ใช้ ซึ่ง profiles.id อ้างอิงถึง (ในฐานข้อมูลชื่อคอลัมน์ id)</w:t>
             </w:r>
           </w:p>
         </w:tc>

</xml_diff>